<commit_message>
Update template and website metadata
</commit_message>
<xml_diff>
--- a/meetings/content-template.docx
+++ b/meetings/content-template.docx
@@ -141,7 +141,7 @@
         <w:t xml:space="preserve">bold</w:t>
       </w:r>
       <w:r>
-        <w:t xml:space="preserve">; keep categorical levels in regular weight.</w:t>
+        <w:t xml:space="preserve">; keep categorical levels in regular weight (including Missing rows, which report missingness for the variable above).</w:t>
       </w:r>
     </w:p>
     <w:p>
@@ -247,7 +247,6 @@
       <w:tblPr>
         <w:tblStyle w:val="Table"/>
         <w:tblW w:type="auto" w:w="0"/>
-        <w:tblLayout w:type="autofit"/>
         <w:tblLook w:firstRow="1" w:lastRow="0" w:firstColumn="0" w:lastColumn="0" w:noHBand="0" w:noVBand="0" w:val="0020"/>
       </w:tblPr>
       <w:tblGrid>
@@ -457,7 +456,6 @@
       <w:tblPr>
         <w:tblStyle w:val="Table"/>
         <w:tblW w:type="auto" w:w="0"/>
-        <w:tblLayout w:type="autofit"/>
         <w:tblLook w:firstRow="1" w:lastRow="0" w:firstColumn="0" w:lastColumn="0" w:noHBand="0" w:noVBand="0" w:val="0020"/>
       </w:tblPr>
       <w:tblGrid>
@@ -576,7 +574,6 @@
       <w:tblPr>
         <w:tblStyle w:val="Table"/>
         <w:tblW w:type="auto" w:w="0"/>
-        <w:tblLayout w:type="autofit"/>
         <w:tblLook w:firstRow="1" w:lastRow="0" w:firstColumn="0" w:lastColumn="0" w:noHBand="0" w:noVBand="0" w:val="0020"/>
       </w:tblPr>
       <w:tblGrid>
@@ -744,7 +741,7 @@
       <w:tblPr>
         <w:tblStyle w:val="Table"/>
         <w:tblW w:type="pct" w:w="5000"/>
-        <w:tblLayout w:type="autofit"/>
+        <w:tblLayout w:type="fixed"/>
         <w:tblLook w:firstRow="1" w:lastRow="0" w:firstColumn="0" w:lastColumn="0" w:noHBand="0" w:noVBand="0" w:val="0020"/>
       </w:tblPr>
       <w:tblGrid>
@@ -3332,7 +3329,7 @@
       <w:tblPr>
         <w:tblStyle w:val="Table"/>
         <w:tblW w:type="pct" w:w="5000"/>
-        <w:tblLayout w:type="autofit"/>
+        <w:tblLayout w:type="fixed"/>
         <w:tblLook w:firstRow="1" w:lastRow="0" w:firstColumn="0" w:lastColumn="0" w:noHBand="0" w:noVBand="0" w:val="0020"/>
       </w:tblPr>
       <w:tblGrid>
@@ -3650,10 +3647,6 @@
               <w:jc w:val="left"/>
             </w:pPr>
             <w:r>
-              <w:rPr>
-                <w:b/>
-                <w:bCs/>
-              </w:rPr>
               <w:t xml:space="preserve">Missing, no. (%)</w:t>
             </w:r>
           </w:p>
@@ -3830,10 +3823,6 @@
               <w:jc w:val="left"/>
             </w:pPr>
             <w:r>
-              <w:rPr>
-                <w:b/>
-                <w:bCs/>
-              </w:rPr>
               <w:t xml:space="preserve">Missing, no. (%)</w:t>
             </w:r>
           </w:p>
@@ -4682,10 +4671,6 @@
               <w:jc w:val="left"/>
             </w:pPr>
             <w:r>
-              <w:rPr>
-                <w:b/>
-                <w:bCs/>
-              </w:rPr>
               <w:t xml:space="preserve">Missing, no. (%)</w:t>
             </w:r>
           </w:p>
@@ -4862,10 +4847,6 @@
               <w:jc w:val="left"/>
             </w:pPr>
             <w:r>
-              <w:rPr>
-                <w:b/>
-                <w:bCs/>
-              </w:rPr>
               <w:t xml:space="preserve">Missing, no. (%)</w:t>
             </w:r>
           </w:p>
@@ -5042,10 +5023,6 @@
               <w:jc w:val="left"/>
             </w:pPr>
             <w:r>
-              <w:rPr>
-                <w:b/>
-                <w:bCs/>
-              </w:rPr>
               <w:t xml:space="preserve">Missing, no. (%)</w:t>
             </w:r>
           </w:p>
@@ -5222,10 +5199,6 @@
               <w:jc w:val="left"/>
             </w:pPr>
             <w:r>
-              <w:rPr>
-                <w:b/>
-                <w:bCs/>
-              </w:rPr>
               <w:t xml:space="preserve">Missing, no. (%)</w:t>
             </w:r>
           </w:p>

</xml_diff>